<commit_message>
Report: add HTML edition and fill in title page details
- build.js now builds the Word file and a self-contained HTML page from one
  content definition (identical text, tables, figures and numbering)
- HTML: sidebar contents, click-to-enlarge figures, responsive, print styles
- title page: Pulchowk Campus (IOE, TU), course Big Data Technology,
  Santosh Tiwari (082MSDSA024) and Arbind Sah (082MSDSA006)
</commit_message>
<xml_diff>
--- a/report/NEPSE_BigData_Project_Report.docx
+++ b/report/NEPSE_BigData_Project_Report.docx
@@ -4,31 +4,22 @@
   <w:body>
     <w:p>
       <w:pPr>
-        <w:spacing w:before="1200" w:after="120"/>
+        <w:spacing w:before="900" w:after="60"/>
         <w:jc w:val="center"/>
       </w:pPr>
       <w:r>
         <w:rPr>
-          <w:shd w:fill="FFFF00" w:color="auto" w:val="clear"/>
+          <w:b/>
+          <w:bCs/>
+          <w:sz w:val="28"/>
+          <w:szCs w:val="28"/>
         </w:rPr>
-        <w:t xml:space="preserve">[NAME OF COLLEGE / UNIVERSITY]</w:t>
-      </w:r>
-    </w:p>
-    <w:p>
-      <w:pPr>
-        <w:spacing w:after="600"/>
-        <w:jc w:val="center"/>
-      </w:pPr>
-      <w:r>
-        <w:rPr>
-          <w:shd w:fill="FFFF00" w:color="auto" w:val="clear"/>
-        </w:rPr>
-        <w:t xml:space="preserve">[Department / Faculty]</w:t>
-      </w:r>
-    </w:p>
-    <w:p>
-      <w:pPr>
-        <w:spacing w:after="120"/>
+        <w:t xml:space="preserve">Tribhuvan University</w:t>
+      </w:r>
+    </w:p>
+    <w:p>
+      <w:pPr>
+        <w:spacing w:after="60"/>
         <w:jc w:val="center"/>
       </w:pPr>
       <w:r>
@@ -36,12 +27,40 @@
           <w:sz w:val="26"/>
           <w:szCs w:val="26"/>
         </w:rPr>
-        <w:t xml:space="preserve">Project Report on</w:t>
+        <w:t xml:space="preserve">Institute of Engineering</w:t>
+      </w:r>
+    </w:p>
+    <w:p>
+      <w:pPr>
+        <w:spacing w:after="700"/>
+        <w:jc w:val="center"/>
+      </w:pPr>
+      <w:r>
+        <w:rPr>
+          <w:b/>
+          <w:bCs/>
+          <w:sz w:val="28"/>
+          <w:szCs w:val="28"/>
+        </w:rPr>
+        <w:t xml:space="preserve">Pulchowk Campus</w:t>
       </w:r>
     </w:p>
     <w:p>
       <w:pPr>
         <w:spacing w:after="160"/>
+        <w:jc w:val="center"/>
+      </w:pPr>
+      <w:r>
+        <w:rPr>
+          <w:sz w:val="26"/>
+          <w:szCs w:val="26"/>
+        </w:rPr>
+        <w:t xml:space="preserve">A Project Report on</w:t>
+      </w:r>
+    </w:p>
+    <w:p>
+      <w:pPr>
+        <w:spacing w:after="120"/>
         <w:jc w:val="center"/>
       </w:pPr>
       <w:r>
@@ -73,7 +92,7 @@
     </w:p>
     <w:p>
       <w:pPr>
-        <w:spacing w:after="900"/>
+        <w:spacing w:after="400"/>
         <w:jc w:val="center"/>
       </w:pPr>
       <w:r>
@@ -88,6 +107,28 @@
     </w:p>
     <w:p>
       <w:pPr>
+        <w:spacing w:after="700"/>
+        <w:jc w:val="center"/>
+      </w:pPr>
+      <w:r>
+        <w:rPr>
+          <w:sz w:val="26"/>
+          <w:szCs w:val="26"/>
+        </w:rPr>
+        <w:t xml:space="preserve">Submitted for the course </w:t>
+      </w:r>
+      <w:r>
+        <w:rPr>
+          <w:b/>
+          <w:bCs/>
+          <w:sz w:val="26"/>
+          <w:szCs w:val="26"/>
+        </w:rPr>
+        <w:t xml:space="preserve">Big Data Technology</w:t>
+      </w:r>
+    </w:p>
+    <w:p>
+      <w:pPr>
         <w:spacing w:after="120"/>
         <w:jc w:val="center"/>
       </w:pPr>
@@ -108,9 +149,10 @@
       </w:pPr>
       <w:r>
         <w:rPr>
-          <w:shd w:fill="FFFF00" w:color="auto" w:val="clear"/>
+          <w:sz w:val="24"/>
+          <w:szCs w:val="24"/>
         </w:rPr>
-        <w:t xml:space="preserve">[Student 1 Name]  —  Roll No. [   ]</w:t>
+        <w:t xml:space="preserve">Santosh Tiwari (082MSDSA024)</w:t>
       </w:r>
     </w:p>
     <w:p>
@@ -120,9 +162,10 @@
       </w:pPr>
       <w:r>
         <w:rPr>
-          <w:shd w:fill="FFFF00" w:color="auto" w:val="clear"/>
+          <w:sz w:val="24"/>
+          <w:szCs w:val="24"/>
         </w:rPr>
-        <w:t xml:space="preserve">[Student 2 Name]  —  Roll No. [   ]</w:t>
+        <w:t xml:space="preserve">Arbind Sah (082MSDSA006)</w:t>
       </w:r>
     </w:p>
     <w:p>
@@ -147,17 +190,22 @@
       </w:pPr>
       <w:r>
         <w:rPr>
+          <w:sz w:val="24"/>
+          <w:szCs w:val="24"/>
           <w:shd w:fill="FFFF00" w:color="auto" w:val="clear"/>
         </w:rPr>
-        <w:t xml:space="preserve">[Teacher's Name], [Course name / code]</w:t>
-      </w:r>
-    </w:p>
-    <w:p>
-      <w:pPr>
+        <w:t xml:space="preserve">[Teacher's Name]</w:t>
+      </w:r>
+    </w:p>
+    <w:p>
+      <w:pPr>
+        <w:spacing/>
         <w:jc w:val="center"/>
       </w:pPr>
       <w:r>
         <w:rPr>
+          <w:sz w:val="24"/>
+          <w:szCs w:val="24"/>
           <w:shd w:fill="FFFF00" w:color="auto" w:val="clear"/>
         </w:rPr>
         <w:t xml:space="preserve">[Submission date]</w:t>
@@ -15922,7 +15970,7 @@
                 <w:sz w:val="19"/>
                 <w:szCs w:val="19"/>
               </w:rPr>
-              <w:t xml:space="preserve">Student 1 — ingestion and storage</w:t>
+              <w:t xml:space="preserve">Santosh Tiwari (082MSDSA024) — ingestion and storage</w:t>
             </w:r>
           </w:p>
         </w:tc>
@@ -15956,7 +16004,7 @@
                 <w:sz w:val="19"/>
                 <w:szCs w:val="19"/>
               </w:rPr>
-              <w:t xml:space="preserve">Student 2 — processing and visualisation</w:t>
+              <w:t xml:space="preserve">Arbind Sah (082MSDSA006) — processing and visualisation</w:t>
             </w:r>
           </w:p>
         </w:tc>

</xml_diff>

<commit_message>
Run the ingestion scripts in Docker; no local virtual environment
- ingestion/Dockerfile: Python 3.12 image, dependencies installed with uv
- docker compose 'producer' service (tools profile) on the stack network,
  Kafka at kafka:9092, ingestion/ and data/ mounted
- scripts/ingest.sh runs any ingestion script in the container as the
  current user (files in data/ stay owned by the user)
- demo.sh uses the container for the market check and the background
  producer (fixed stdin being consumed by docker compose run)
- README and report 'How to run' no longer mention .venv
</commit_message>
<xml_diff>
--- a/report/NEPSE_BigData_Project_Report.docx
+++ b/report/NEPSE_BigData_Project_Report.docx
@@ -9329,7 +9329,7 @@
                 <w:sz w:val="19"/>
                 <w:szCs w:val="19"/>
               </w:rPr>
-              <w:t xml:space="preserve">Python (host producers)</w:t>
+              <w:t xml:space="preserve">Python + uv (ingestion container)</w:t>
             </w:r>
           </w:p>
         </w:tc>
@@ -9360,7 +9360,7 @@
                 <w:sz w:val="19"/>
                 <w:szCs w:val="19"/>
               </w:rPr>
-              <w:t xml:space="preserve">3.13</w:t>
+              <w:t xml:space="preserve">3.12 / 0.4</w:t>
             </w:r>
           </w:p>
         </w:tc>
@@ -15100,7 +15100,7 @@
         <w:jc w:val="both"/>
       </w:pPr>
       <w:r>
-        <w:t xml:space="preserve">First-time setup (needs internet once):</w:t>
+        <w:t xml:space="preserve">Everything runs in Docker, including the Python data-collection and producer scripts (their image installs the dependencies with uv), so no local Python or virtual environment is needed. First-time setup (needs internet once):</w:t>
       </w:r>
     </w:p>
     <w:p>
@@ -15115,7 +15115,7 @@
           <w:sz w:val="18"/>
           <w:szCs w:val="18"/>
         </w:rPr>
-        <w:t xml:space="preserve">python3 -m venv .venv &amp;&amp; .venv/bin/pip install -r requirements.txt</w:t>
+        <w:t xml:space="preserve">./scripts/start.sh                    # build/pull images, start Kafka, HDFS, Spark, dashboard</w:t>
       </w:r>
     </w:p>
     <w:p>
@@ -15130,7 +15130,7 @@
           <w:sz w:val="18"/>
           <w:szCs w:val="18"/>
         </w:rPr>
-        <w:t xml:space="preserve">./scripts/start.sh              # build/pull images, start Kafka, HDFS, Spark, dashboard</w:t>
+        <w:t xml:space="preserve">./scripts/verify.sh                   # health check + Spark &lt;-&gt; Kafka &lt;-&gt; HDFS smoke test</w:t>
       </w:r>
     </w:p>
     <w:p>
@@ -15145,7 +15145,7 @@
           <w:sz w:val="18"/>
           <w:szCs w:val="18"/>
         </w:rPr>
-        <w:t xml:space="preserve">./scripts/verify.sh             # health check + Spark &lt;-&gt; Kafka &lt;-&gt; HDFS smoke test</w:t>
+        <w:t xml:space="preserve">./scripts/ingest.sh fetch_companies   # company list (runs in the ingestion container)</w:t>
       </w:r>
     </w:p>
     <w:p>
@@ -15160,13 +15160,13 @@
           <w:sz w:val="18"/>
           <w:szCs w:val="18"/>
         </w:rPr>
-        <w:t xml:space="preserve">.venv/bin/python ingestion/fetch_companies.py</w:t>
+        <w:t xml:space="preserve">./scripts/ingest.sh fetch_history     # full price history</w:t>
       </w:r>
     </w:p>
     <w:p>
       <w:pPr>
         <w:shd w:fill="F2F2F2" w:color="auto" w:val="clear"/>
-        <w:spacing w:before="0" w:after="0" w:line="240"/>
+        <w:spacing w:before="0" w:after="160" w:line="240"/>
         <w:ind w:left="120" w:right="120"/>
       </w:pPr>
       <w:r>
@@ -15175,22 +15175,7 @@
           <w:sz w:val="18"/>
           <w:szCs w:val="18"/>
         </w:rPr>
-        <w:t xml:space="preserve">.venv/bin/python ingestion/fetch_history.py</w:t>
-      </w:r>
-    </w:p>
-    <w:p>
-      <w:pPr>
-        <w:shd w:fill="F2F2F2" w:color="auto" w:val="clear"/>
-        <w:spacing w:before="0" w:after="160" w:line="240"/>
-        <w:ind w:left="120" w:right="120"/>
-      </w:pPr>
-      <w:r>
-        <w:rPr>
-          <w:rFonts w:ascii="Consolas" w:cs="Consolas" w:eastAsia="Consolas" w:hAnsi="Consolas"/>
-          <w:sz w:val="18"/>
-          <w:szCs w:val="18"/>
-        </w:rPr>
-        <w:t xml:space="preserve">./scripts/run_batch.sh          # bronze -&gt; silver -&gt; gold -&gt; MLlib -&gt; Spark SQL</w:t>
+        <w:t xml:space="preserve">./scripts/run_batch.sh                # bronze -&gt; silver -&gt; gold -&gt; MLlib -&gt; Spark SQL</w:t>
       </w:r>
     </w:p>
     <w:p>
@@ -15304,7 +15289,7 @@
           <w:sz w:val="18"/>
           <w:szCs w:val="18"/>
         </w:rPr>
-        <w:t xml:space="preserve">.venv/bin/python ingestion/replay_producer.py --loop     # or live_producer.py</w:t>
+        <w:t xml:space="preserve">./scripts/ingest.sh replay_producer --loop     # or live_producer</w:t>
       </w:r>
     </w:p>
     <w:p>
@@ -15761,7 +15746,7 @@
           <w:sz w:val="18"/>
           <w:szCs w:val="18"/>
         </w:rPr>
-        <w:t xml:space="preserve">                        live_producer.py, replay_producer.py, common.py</w:t>
+        <w:t xml:space="preserve">                        live_producer.py, replay_producer.py, common.py, Dockerfile</w:t>
       </w:r>
     </w:p>
     <w:p>
@@ -15851,7 +15836,7 @@
           <w:sz w:val="18"/>
           <w:szCs w:val="18"/>
         </w:rPr>
-        <w:t xml:space="preserve">scripts/                start, stop, init, verify, run_batch, stream, spark_submit, demo</w:t>
+        <w:t xml:space="preserve">scripts/                start, stop, init, verify, run_batch, stream, spark_submit, ingest, demo</w:t>
       </w:r>
     </w:p>
     <w:p>

</xml_diff>

<commit_message>
Report: formal Appendix A (setup steps table), drop demo-day notes
</commit_message>
<xml_diff>
--- a/report/NEPSE_BigData_Project_Report.docx
+++ b/report/NEPSE_BigData_Project_Report.docx
@@ -15091,7 +15091,7 @@
         <w:pageBreakBefore/>
       </w:pPr>
       <w:r>
-        <w:t xml:space="preserve">Appendix A: How to Run</w:t>
+        <w:t xml:space="preserve">Appendix A: Installation and Execution</w:t>
       </w:r>
     </w:p>
     <w:p>
@@ -15100,196 +15100,7 @@
         <w:jc w:val="both"/>
       </w:pPr>
       <w:r>
-        <w:t xml:space="preserve">Everything runs in Docker, including the Python data-collection and producer scripts (their image installs the dependencies with uv), so no local Python or virtual environment is needed. First-time setup (needs internet once):</w:t>
-      </w:r>
-    </w:p>
-    <w:p>
-      <w:pPr>
-        <w:shd w:fill="F2F2F2" w:color="auto" w:val="clear"/>
-        <w:spacing w:before="60" w:after="0" w:line="240"/>
-        <w:ind w:left="120" w:right="120"/>
-      </w:pPr>
-      <w:r>
-        <w:rPr>
-          <w:rFonts w:ascii="Consolas" w:cs="Consolas" w:eastAsia="Consolas" w:hAnsi="Consolas"/>
-          <w:sz w:val="18"/>
-          <w:szCs w:val="18"/>
-        </w:rPr>
-        <w:t xml:space="preserve">./scripts/start.sh                    # build/pull images, start Kafka, HDFS, Spark, dashboard</w:t>
-      </w:r>
-    </w:p>
-    <w:p>
-      <w:pPr>
-        <w:shd w:fill="F2F2F2" w:color="auto" w:val="clear"/>
-        <w:spacing w:before="0" w:after="0" w:line="240"/>
-        <w:ind w:left="120" w:right="120"/>
-      </w:pPr>
-      <w:r>
-        <w:rPr>
-          <w:rFonts w:ascii="Consolas" w:cs="Consolas" w:eastAsia="Consolas" w:hAnsi="Consolas"/>
-          <w:sz w:val="18"/>
-          <w:szCs w:val="18"/>
-        </w:rPr>
-        <w:t xml:space="preserve">./scripts/verify.sh                   # health check + Spark &lt;-&gt; Kafka &lt;-&gt; HDFS smoke test</w:t>
-      </w:r>
-    </w:p>
-    <w:p>
-      <w:pPr>
-        <w:shd w:fill="F2F2F2" w:color="auto" w:val="clear"/>
-        <w:spacing w:before="0" w:after="0" w:line="240"/>
-        <w:ind w:left="120" w:right="120"/>
-      </w:pPr>
-      <w:r>
-        <w:rPr>
-          <w:rFonts w:ascii="Consolas" w:cs="Consolas" w:eastAsia="Consolas" w:hAnsi="Consolas"/>
-          <w:sz w:val="18"/>
-          <w:szCs w:val="18"/>
-        </w:rPr>
-        <w:t xml:space="preserve">./scripts/ingest.sh fetch_companies   # company list (runs in the ingestion container)</w:t>
-      </w:r>
-    </w:p>
-    <w:p>
-      <w:pPr>
-        <w:shd w:fill="F2F2F2" w:color="auto" w:val="clear"/>
-        <w:spacing w:before="0" w:after="0" w:line="240"/>
-        <w:ind w:left="120" w:right="120"/>
-      </w:pPr>
-      <w:r>
-        <w:rPr>
-          <w:rFonts w:ascii="Consolas" w:cs="Consolas" w:eastAsia="Consolas" w:hAnsi="Consolas"/>
-          <w:sz w:val="18"/>
-          <w:szCs w:val="18"/>
-        </w:rPr>
-        <w:t xml:space="preserve">./scripts/ingest.sh fetch_history     # full price history</w:t>
-      </w:r>
-    </w:p>
-    <w:p>
-      <w:pPr>
-        <w:shd w:fill="F2F2F2" w:color="auto" w:val="clear"/>
-        <w:spacing w:before="0" w:after="160" w:line="240"/>
-        <w:ind w:left="120" w:right="120"/>
-      </w:pPr>
-      <w:r>
-        <w:rPr>
-          <w:rFonts w:ascii="Consolas" w:cs="Consolas" w:eastAsia="Consolas" w:hAnsi="Consolas"/>
-          <w:sz w:val="18"/>
-          <w:szCs w:val="18"/>
-        </w:rPr>
-        <w:t xml:space="preserve">./scripts/run_batch.sh                # bronze -&gt; silver -&gt; gold -&gt; MLlib -&gt; Spark SQL</w:t>
-      </w:r>
-    </w:p>
-    <w:p>
-      <w:pPr>
-        <w:spacing w:after="120" w:line="276"/>
-        <w:jc w:val="both"/>
-      </w:pPr>
-      <w:r>
-        <w:t xml:space="preserve">Demo day (works offline):</w:t>
-      </w:r>
-    </w:p>
-    <w:p>
-      <w:pPr>
-        <w:shd w:fill="F2F2F2" w:color="auto" w:val="clear"/>
-        <w:spacing w:before="60" w:after="0" w:line="240"/>
-        <w:ind w:left="120" w:right="120"/>
-      </w:pPr>
-      <w:r>
-        <w:rPr>
-          <w:rFonts w:ascii="Consolas" w:cs="Consolas" w:eastAsia="Consolas" w:hAnsi="Consolas"/>
-          <w:sz w:val="18"/>
-          <w:szCs w:val="18"/>
-        </w:rPr>
-        <w:t xml:space="preserve">./scripts/demo.sh               # guided demo, LIVE if the market is open, else REPLAY</w:t>
-      </w:r>
-    </w:p>
-    <w:p>
-      <w:pPr>
-        <w:shd w:fill="F2F2F2" w:color="auto" w:val="clear"/>
-        <w:spacing w:before="0" w:after="0" w:line="240"/>
-        <w:ind w:left="120" w:right="120"/>
-      </w:pPr>
-      <w:r>
-        <w:rPr>
-          <w:rFonts w:ascii="Consolas" w:cs="Consolas" w:eastAsia="Consolas" w:hAnsi="Consolas"/>
-          <w:sz w:val="18"/>
-          <w:szCs w:val="18"/>
-        </w:rPr>
-        <w:t xml:space="preserve">./scripts/demo.sh --replay --speed 10</w:t>
-      </w:r>
-    </w:p>
-    <w:p>
-      <w:pPr>
-        <w:shd w:fill="F2F2F2" w:color="auto" w:val="clear"/>
-        <w:spacing w:before="0" w:after="0" w:line="240"/>
-        <w:ind w:left="120" w:right="120"/>
-      </w:pPr>
-      <w:r>
-        <w:rPr>
-          <w:rFonts w:ascii="Consolas" w:cs="Consolas" w:eastAsia="Consolas" w:hAnsi="Consolas"/>
-          <w:sz w:val="18"/>
-          <w:szCs w:val="18"/>
-        </w:rPr>
-        <w:t xml:space="preserve"> </w:t>
-      </w:r>
-    </w:p>
-    <w:p>
-      <w:pPr>
-        <w:shd w:fill="F2F2F2" w:color="auto" w:val="clear"/>
-        <w:spacing w:before="0" w:after="0" w:line="240"/>
-        <w:ind w:left="120" w:right="120"/>
-      </w:pPr>
-      <w:r>
-        <w:rPr>
-          <w:rFonts w:ascii="Consolas" w:cs="Consolas" w:eastAsia="Consolas" w:hAnsi="Consolas"/>
-          <w:sz w:val="18"/>
-          <w:szCs w:val="18"/>
-        </w:rPr>
-        <w:t xml:space="preserve"># manual equivalent</w:t>
-      </w:r>
-    </w:p>
-    <w:p>
-      <w:pPr>
-        <w:shd w:fill="F2F2F2" w:color="auto" w:val="clear"/>
-        <w:spacing w:before="0" w:after="0" w:line="240"/>
-        <w:ind w:left="120" w:right="120"/>
-      </w:pPr>
-      <w:r>
-        <w:rPr>
-          <w:rFonts w:ascii="Consolas" w:cs="Consolas" w:eastAsia="Consolas" w:hAnsi="Consolas"/>
-          <w:sz w:val="18"/>
-          <w:szCs w:val="18"/>
-        </w:rPr>
-        <w:t xml:space="preserve">./scripts/start.sh</w:t>
-      </w:r>
-    </w:p>
-    <w:p>
-      <w:pPr>
-        <w:shd w:fill="F2F2F2" w:color="auto" w:val="clear"/>
-        <w:spacing w:before="0" w:after="0" w:line="240"/>
-        <w:ind w:left="120" w:right="120"/>
-      </w:pPr>
-      <w:r>
-        <w:rPr>
-          <w:rFonts w:ascii="Consolas" w:cs="Consolas" w:eastAsia="Consolas" w:hAnsi="Consolas"/>
-          <w:sz w:val="18"/>
-          <w:szCs w:val="18"/>
-        </w:rPr>
-        <w:t xml:space="preserve">./scripts/stream.sh start</w:t>
-      </w:r>
-    </w:p>
-    <w:p>
-      <w:pPr>
-        <w:shd w:fill="F2F2F2" w:color="auto" w:val="clear"/>
-        <w:spacing w:before="0" w:after="160" w:line="240"/>
-        <w:ind w:left="120" w:right="120"/>
-      </w:pPr>
-      <w:r>
-        <w:rPr>
-          <w:rFonts w:ascii="Consolas" w:cs="Consolas" w:eastAsia="Consolas" w:hAnsi="Consolas"/>
-          <w:sz w:val="18"/>
-          <w:szCs w:val="18"/>
-        </w:rPr>
-        <w:t xml:space="preserve">./scripts/ingest.sh replay_producer --loop     # or live_producer</w:t>
+        <w:t xml:space="preserve">All components of the system run as Docker containers managed with Docker Compose, including the Python data-collection and producer scripts, so no local Python installation is required. Table 16 lists the commands used to set up and operate the system, in order.</w:t>
       </w:r>
     </w:p>
     <w:p>
@@ -15307,6 +15118,771 @@
           <w:szCs w:val="20"/>
         </w:rPr>
         <w:t xml:space="preserve">Table 16: </w:t>
+      </w:r>
+      <w:r>
+        <w:rPr>
+          <w:i/>
+          <w:iCs/>
+          <w:sz w:val="20"/>
+          <w:szCs w:val="20"/>
+        </w:rPr>
+        <w:t xml:space="preserve">Setup and execution commands</w:t>
+      </w:r>
+    </w:p>
+    <w:tbl>
+      <w:tblPr>
+        <w:tblW w:type="dxa" w:w="9026"/>
+        <w:tblBorders>
+          <w:top w:val="single" w:color="auto" w:sz="4"/>
+          <w:left w:val="single" w:color="auto" w:sz="4"/>
+          <w:bottom w:val="single" w:color="auto" w:sz="4"/>
+          <w:right w:val="single" w:color="auto" w:sz="4"/>
+          <w:insideH w:val="single" w:color="auto" w:sz="4"/>
+          <w:insideV w:val="single" w:color="auto" w:sz="4"/>
+        </w:tblBorders>
+      </w:tblPr>
+      <w:tblGrid>
+        <w:gridCol w:w="1805"/>
+        <w:gridCol w:w="3069"/>
+        <w:gridCol w:w="4152"/>
+      </w:tblGrid>
+      <w:tr>
+        <w:trPr>
+          <w:tblHeader/>
+        </w:trPr>
+        <w:tc>
+          <w:tcPr>
+            <w:tcW w:type="dxa" w:w="1805"/>
+            <w:tcBorders>
+              <w:top w:val="single" w:color="A6A6A6" w:sz="4"/>
+              <w:left w:val="single" w:color="A6A6A6" w:sz="4"/>
+              <w:bottom w:val="single" w:color="A6A6A6" w:sz="4"/>
+              <w:right w:val="single" w:color="A6A6A6" w:sz="4"/>
+            </w:tcBorders>
+            <w:shd w:fill="DCE6F1" w:color="auto" w:val="clear"/>
+            <w:tcMar>
+              <w:top w:type="dxa" w:w="50"/>
+              <w:left w:type="dxa" w:w="90"/>
+              <w:bottom w:type="dxa" w:w="50"/>
+              <w:right w:type="dxa" w:w="90"/>
+            </w:tcMar>
+            <w:vAlign w:val="center"/>
+          </w:tcPr>
+          <w:p>
+            <w:pPr>
+              <w:spacing w:after="0" w:line="252"/>
+              <w:jc w:val="left"/>
+            </w:pPr>
+            <w:r>
+              <w:rPr>
+                <w:b/>
+                <w:bCs/>
+                <w:sz w:val="19"/>
+                <w:szCs w:val="19"/>
+              </w:rPr>
+              <w:t xml:space="preserve">Step</w:t>
+            </w:r>
+          </w:p>
+        </w:tc>
+        <w:tc>
+          <w:tcPr>
+            <w:tcW w:type="dxa" w:w="3069"/>
+            <w:tcBorders>
+              <w:top w:val="single" w:color="A6A6A6" w:sz="4"/>
+              <w:left w:val="single" w:color="A6A6A6" w:sz="4"/>
+              <w:bottom w:val="single" w:color="A6A6A6" w:sz="4"/>
+              <w:right w:val="single" w:color="A6A6A6" w:sz="4"/>
+            </w:tcBorders>
+            <w:shd w:fill="DCE6F1" w:color="auto" w:val="clear"/>
+            <w:tcMar>
+              <w:top w:type="dxa" w:w="50"/>
+              <w:left w:type="dxa" w:w="90"/>
+              <w:bottom w:type="dxa" w:w="50"/>
+              <w:right w:type="dxa" w:w="90"/>
+            </w:tcMar>
+            <w:vAlign w:val="center"/>
+          </w:tcPr>
+          <w:p>
+            <w:pPr>
+              <w:spacing w:after="0" w:line="252"/>
+              <w:jc w:val="left"/>
+            </w:pPr>
+            <w:r>
+              <w:rPr>
+                <w:b/>
+                <w:bCs/>
+                <w:sz w:val="19"/>
+                <w:szCs w:val="19"/>
+              </w:rPr>
+              <w:t xml:space="preserve">Command</w:t>
+            </w:r>
+          </w:p>
+        </w:tc>
+        <w:tc>
+          <w:tcPr>
+            <w:tcW w:type="dxa" w:w="4152"/>
+            <w:tcBorders>
+              <w:top w:val="single" w:color="A6A6A6" w:sz="4"/>
+              <w:left w:val="single" w:color="A6A6A6" w:sz="4"/>
+              <w:bottom w:val="single" w:color="A6A6A6" w:sz="4"/>
+              <w:right w:val="single" w:color="A6A6A6" w:sz="4"/>
+            </w:tcBorders>
+            <w:shd w:fill="DCE6F1" w:color="auto" w:val="clear"/>
+            <w:tcMar>
+              <w:top w:type="dxa" w:w="50"/>
+              <w:left w:type="dxa" w:w="90"/>
+              <w:bottom w:type="dxa" w:w="50"/>
+              <w:right w:type="dxa" w:w="90"/>
+            </w:tcMar>
+            <w:vAlign w:val="center"/>
+          </w:tcPr>
+          <w:p>
+            <w:pPr>
+              <w:spacing w:after="0" w:line="252"/>
+              <w:jc w:val="left"/>
+            </w:pPr>
+            <w:r>
+              <w:rPr>
+                <w:b/>
+                <w:bCs/>
+                <w:sz w:val="19"/>
+                <w:szCs w:val="19"/>
+              </w:rPr>
+              <w:t xml:space="preserve">Purpose</w:t>
+            </w:r>
+          </w:p>
+        </w:tc>
+      </w:tr>
+      <w:tr>
+        <w:trPr>
+          <w:cantSplit/>
+        </w:trPr>
+        <w:tc>
+          <w:tcPr>
+            <w:tcW w:type="dxa" w:w="1805"/>
+            <w:tcBorders>
+              <w:top w:val="single" w:color="A6A6A6" w:sz="4"/>
+              <w:left w:val="single" w:color="A6A6A6" w:sz="4"/>
+              <w:bottom w:val="single" w:color="A6A6A6" w:sz="4"/>
+              <w:right w:val="single" w:color="A6A6A6" w:sz="4"/>
+            </w:tcBorders>
+            <w:tcMar>
+              <w:top w:type="dxa" w:w="50"/>
+              <w:left w:type="dxa" w:w="90"/>
+              <w:bottom w:type="dxa" w:w="50"/>
+              <w:right w:type="dxa" w:w="90"/>
+            </w:tcMar>
+            <w:vAlign w:val="center"/>
+          </w:tcPr>
+          <w:p>
+            <w:pPr>
+              <w:spacing w:after="0" w:line="252"/>
+              <w:jc w:val="left"/>
+            </w:pPr>
+            <w:r>
+              <w:rPr>
+                <w:sz w:val="19"/>
+                <w:szCs w:val="19"/>
+              </w:rPr>
+              <w:t xml:space="preserve">1. Start services</w:t>
+            </w:r>
+          </w:p>
+        </w:tc>
+        <w:tc>
+          <w:tcPr>
+            <w:tcW w:type="dxa" w:w="3069"/>
+            <w:tcBorders>
+              <w:top w:val="single" w:color="A6A6A6" w:sz="4"/>
+              <w:left w:val="single" w:color="A6A6A6" w:sz="4"/>
+              <w:bottom w:val="single" w:color="A6A6A6" w:sz="4"/>
+              <w:right w:val="single" w:color="A6A6A6" w:sz="4"/>
+            </w:tcBorders>
+            <w:tcMar>
+              <w:top w:type="dxa" w:w="50"/>
+              <w:left w:type="dxa" w:w="90"/>
+              <w:bottom w:type="dxa" w:w="50"/>
+              <w:right w:type="dxa" w:w="90"/>
+            </w:tcMar>
+            <w:vAlign w:val="center"/>
+          </w:tcPr>
+          <w:p>
+            <w:pPr>
+              <w:spacing w:after="0" w:line="252"/>
+              <w:jc w:val="left"/>
+            </w:pPr>
+            <w:r>
+              <w:rPr>
+                <w:rFonts w:ascii="Consolas" w:cs="Consolas" w:eastAsia="Consolas" w:hAnsi="Consolas"/>
+                <w:sz w:val="19"/>
+                <w:szCs w:val="19"/>
+              </w:rPr>
+              <w:t xml:space="preserve">./scripts/start.sh</w:t>
+            </w:r>
+          </w:p>
+        </w:tc>
+        <w:tc>
+          <w:tcPr>
+            <w:tcW w:type="dxa" w:w="4152"/>
+            <w:tcBorders>
+              <w:top w:val="single" w:color="A6A6A6" w:sz="4"/>
+              <w:left w:val="single" w:color="A6A6A6" w:sz="4"/>
+              <w:bottom w:val="single" w:color="A6A6A6" w:sz="4"/>
+              <w:right w:val="single" w:color="A6A6A6" w:sz="4"/>
+            </w:tcBorders>
+            <w:tcMar>
+              <w:top w:type="dxa" w:w="50"/>
+              <w:left w:type="dxa" w:w="90"/>
+              <w:bottom w:type="dxa" w:w="50"/>
+              <w:right w:type="dxa" w:w="90"/>
+            </w:tcMar>
+            <w:vAlign w:val="center"/>
+          </w:tcPr>
+          <w:p>
+            <w:pPr>
+              <w:spacing w:after="0" w:line="252"/>
+              <w:jc w:val="left"/>
+            </w:pPr>
+            <w:r>
+              <w:rPr>
+                <w:sz w:val="19"/>
+                <w:szCs w:val="19"/>
+              </w:rPr>
+              <w:t xml:space="preserve">Starts Kafka, HDFS, Spark and the dashboard; creates the Kafka topics and HDFS directories</w:t>
+            </w:r>
+          </w:p>
+        </w:tc>
+      </w:tr>
+      <w:tr>
+        <w:trPr>
+          <w:cantSplit/>
+        </w:trPr>
+        <w:tc>
+          <w:tcPr>
+            <w:tcW w:type="dxa" w:w="1805"/>
+            <w:tcBorders>
+              <w:top w:val="single" w:color="A6A6A6" w:sz="4"/>
+              <w:left w:val="single" w:color="A6A6A6" w:sz="4"/>
+              <w:bottom w:val="single" w:color="A6A6A6" w:sz="4"/>
+              <w:right w:val="single" w:color="A6A6A6" w:sz="4"/>
+            </w:tcBorders>
+            <w:tcMar>
+              <w:top w:type="dxa" w:w="50"/>
+              <w:left w:type="dxa" w:w="90"/>
+              <w:bottom w:type="dxa" w:w="50"/>
+              <w:right w:type="dxa" w:w="90"/>
+            </w:tcMar>
+            <w:vAlign w:val="center"/>
+          </w:tcPr>
+          <w:p>
+            <w:pPr>
+              <w:spacing w:after="0" w:line="252"/>
+              <w:jc w:val="left"/>
+            </w:pPr>
+            <w:r>
+              <w:rPr>
+                <w:sz w:val="19"/>
+                <w:szCs w:val="19"/>
+              </w:rPr>
+              <w:t xml:space="preserve">2. Verify</w:t>
+            </w:r>
+          </w:p>
+        </w:tc>
+        <w:tc>
+          <w:tcPr>
+            <w:tcW w:type="dxa" w:w="3069"/>
+            <w:tcBorders>
+              <w:top w:val="single" w:color="A6A6A6" w:sz="4"/>
+              <w:left w:val="single" w:color="A6A6A6" w:sz="4"/>
+              <w:bottom w:val="single" w:color="A6A6A6" w:sz="4"/>
+              <w:right w:val="single" w:color="A6A6A6" w:sz="4"/>
+            </w:tcBorders>
+            <w:tcMar>
+              <w:top w:type="dxa" w:w="50"/>
+              <w:left w:type="dxa" w:w="90"/>
+              <w:bottom w:type="dxa" w:w="50"/>
+              <w:right w:type="dxa" w:w="90"/>
+            </w:tcMar>
+            <w:vAlign w:val="center"/>
+          </w:tcPr>
+          <w:p>
+            <w:pPr>
+              <w:spacing w:after="0" w:line="252"/>
+              <w:jc w:val="left"/>
+            </w:pPr>
+            <w:r>
+              <w:rPr>
+                <w:rFonts w:ascii="Consolas" w:cs="Consolas" w:eastAsia="Consolas" w:hAnsi="Consolas"/>
+                <w:sz w:val="19"/>
+                <w:szCs w:val="19"/>
+              </w:rPr>
+              <w:t xml:space="preserve">./scripts/verify.sh</w:t>
+            </w:r>
+          </w:p>
+        </w:tc>
+        <w:tc>
+          <w:tcPr>
+            <w:tcW w:type="dxa" w:w="4152"/>
+            <w:tcBorders>
+              <w:top w:val="single" w:color="A6A6A6" w:sz="4"/>
+              <w:left w:val="single" w:color="A6A6A6" w:sz="4"/>
+              <w:bottom w:val="single" w:color="A6A6A6" w:sz="4"/>
+              <w:right w:val="single" w:color="A6A6A6" w:sz="4"/>
+            </w:tcBorders>
+            <w:tcMar>
+              <w:top w:type="dxa" w:w="50"/>
+              <w:left w:type="dxa" w:w="90"/>
+              <w:bottom w:type="dxa" w:w="50"/>
+              <w:right w:type="dxa" w:w="90"/>
+            </w:tcMar>
+            <w:vAlign w:val="center"/>
+          </w:tcPr>
+          <w:p>
+            <w:pPr>
+              <w:spacing w:after="0" w:line="252"/>
+              <w:jc w:val="left"/>
+            </w:pPr>
+            <w:r>
+              <w:rPr>
+                <w:sz w:val="19"/>
+                <w:szCs w:val="19"/>
+              </w:rPr>
+              <w:t xml:space="preserve">Checks every service and runs an end-to-end Spark–Kafka–HDFS test</w:t>
+            </w:r>
+          </w:p>
+        </w:tc>
+      </w:tr>
+      <w:tr>
+        <w:trPr>
+          <w:cantSplit/>
+        </w:trPr>
+        <w:tc>
+          <w:tcPr>
+            <w:tcW w:type="dxa" w:w="1805"/>
+            <w:tcBorders>
+              <w:top w:val="single" w:color="A6A6A6" w:sz="4"/>
+              <w:left w:val="single" w:color="A6A6A6" w:sz="4"/>
+              <w:bottom w:val="single" w:color="A6A6A6" w:sz="4"/>
+              <w:right w:val="single" w:color="A6A6A6" w:sz="4"/>
+            </w:tcBorders>
+            <w:tcMar>
+              <w:top w:type="dxa" w:w="50"/>
+              <w:left w:type="dxa" w:w="90"/>
+              <w:bottom w:type="dxa" w:w="50"/>
+              <w:right w:type="dxa" w:w="90"/>
+            </w:tcMar>
+            <w:vAlign w:val="center"/>
+          </w:tcPr>
+          <w:p>
+            <w:pPr>
+              <w:spacing w:after="0" w:line="252"/>
+              <w:jc w:val="left"/>
+            </w:pPr>
+            <w:r>
+              <w:rPr>
+                <w:sz w:val="19"/>
+                <w:szCs w:val="19"/>
+              </w:rPr>
+              <w:t xml:space="preserve">3. Collect data</w:t>
+            </w:r>
+          </w:p>
+        </w:tc>
+        <w:tc>
+          <w:tcPr>
+            <w:tcW w:type="dxa" w:w="3069"/>
+            <w:tcBorders>
+              <w:top w:val="single" w:color="A6A6A6" w:sz="4"/>
+              <w:left w:val="single" w:color="A6A6A6" w:sz="4"/>
+              <w:bottom w:val="single" w:color="A6A6A6" w:sz="4"/>
+              <w:right w:val="single" w:color="A6A6A6" w:sz="4"/>
+            </w:tcBorders>
+            <w:tcMar>
+              <w:top w:type="dxa" w:w="50"/>
+              <w:left w:type="dxa" w:w="90"/>
+              <w:bottom w:type="dxa" w:w="50"/>
+              <w:right w:type="dxa" w:w="90"/>
+            </w:tcMar>
+            <w:vAlign w:val="center"/>
+          </w:tcPr>
+          <w:p>
+            <w:pPr>
+              <w:spacing w:after="0" w:line="252"/>
+              <w:jc w:val="left"/>
+            </w:pPr>
+            <w:r>
+              <w:rPr>
+                <w:rFonts w:ascii="Consolas" w:cs="Consolas" w:eastAsia="Consolas" w:hAnsi="Consolas"/>
+                <w:sz w:val="19"/>
+                <w:szCs w:val="19"/>
+              </w:rPr>
+              <w:t xml:space="preserve">./scripts/ingest.sh fetch_history</w:t>
+            </w:r>
+          </w:p>
+        </w:tc>
+        <w:tc>
+          <w:tcPr>
+            <w:tcW w:type="dxa" w:w="4152"/>
+            <w:tcBorders>
+              <w:top w:val="single" w:color="A6A6A6" w:sz="4"/>
+              <w:left w:val="single" w:color="A6A6A6" w:sz="4"/>
+              <w:bottom w:val="single" w:color="A6A6A6" w:sz="4"/>
+              <w:right w:val="single" w:color="A6A6A6" w:sz="4"/>
+            </w:tcBorders>
+            <w:tcMar>
+              <w:top w:type="dxa" w:w="50"/>
+              <w:left w:type="dxa" w:w="90"/>
+              <w:bottom w:type="dxa" w:w="50"/>
+              <w:right w:type="dxa" w:w="90"/>
+            </w:tcMar>
+            <w:vAlign w:val="center"/>
+          </w:tcPr>
+          <w:p>
+            <w:pPr>
+              <w:spacing w:after="0" w:line="252"/>
+              <w:jc w:val="left"/>
+            </w:pPr>
+            <w:r>
+              <w:rPr>
+                <w:sz w:val="19"/>
+                <w:szCs w:val="19"/>
+              </w:rPr>
+              <w:t xml:space="preserve">Downloads daily price history and the NEPSE index (the company list is included in the repository)</w:t>
+            </w:r>
+          </w:p>
+        </w:tc>
+      </w:tr>
+      <w:tr>
+        <w:trPr>
+          <w:cantSplit/>
+        </w:trPr>
+        <w:tc>
+          <w:tcPr>
+            <w:tcW w:type="dxa" w:w="1805"/>
+            <w:tcBorders>
+              <w:top w:val="single" w:color="A6A6A6" w:sz="4"/>
+              <w:left w:val="single" w:color="A6A6A6" w:sz="4"/>
+              <w:bottom w:val="single" w:color="A6A6A6" w:sz="4"/>
+              <w:right w:val="single" w:color="A6A6A6" w:sz="4"/>
+            </w:tcBorders>
+            <w:tcMar>
+              <w:top w:type="dxa" w:w="50"/>
+              <w:left w:type="dxa" w:w="90"/>
+              <w:bottom w:type="dxa" w:w="50"/>
+              <w:right w:type="dxa" w:w="90"/>
+            </w:tcMar>
+            <w:vAlign w:val="center"/>
+          </w:tcPr>
+          <w:p>
+            <w:pPr>
+              <w:spacing w:after="0" w:line="252"/>
+              <w:jc w:val="left"/>
+            </w:pPr>
+            <w:r>
+              <w:rPr>
+                <w:sz w:val="19"/>
+                <w:szCs w:val="19"/>
+              </w:rPr>
+              <w:t xml:space="preserve">4. Batch processing</w:t>
+            </w:r>
+          </w:p>
+        </w:tc>
+        <w:tc>
+          <w:tcPr>
+            <w:tcW w:type="dxa" w:w="3069"/>
+            <w:tcBorders>
+              <w:top w:val="single" w:color="A6A6A6" w:sz="4"/>
+              <w:left w:val="single" w:color="A6A6A6" w:sz="4"/>
+              <w:bottom w:val="single" w:color="A6A6A6" w:sz="4"/>
+              <w:right w:val="single" w:color="A6A6A6" w:sz="4"/>
+            </w:tcBorders>
+            <w:tcMar>
+              <w:top w:type="dxa" w:w="50"/>
+              <w:left w:type="dxa" w:w="90"/>
+              <w:bottom w:type="dxa" w:w="50"/>
+              <w:right w:type="dxa" w:w="90"/>
+            </w:tcMar>
+            <w:vAlign w:val="center"/>
+          </w:tcPr>
+          <w:p>
+            <w:pPr>
+              <w:spacing w:after="0" w:line="252"/>
+              <w:jc w:val="left"/>
+            </w:pPr>
+            <w:r>
+              <w:rPr>
+                <w:rFonts w:ascii="Consolas" w:cs="Consolas" w:eastAsia="Consolas" w:hAnsi="Consolas"/>
+                <w:sz w:val="19"/>
+                <w:szCs w:val="19"/>
+              </w:rPr>
+              <w:t xml:space="preserve">./scripts/run_batch.sh</w:t>
+            </w:r>
+          </w:p>
+        </w:tc>
+        <w:tc>
+          <w:tcPr>
+            <w:tcW w:type="dxa" w:w="4152"/>
+            <w:tcBorders>
+              <w:top w:val="single" w:color="A6A6A6" w:sz="4"/>
+              <w:left w:val="single" w:color="A6A6A6" w:sz="4"/>
+              <w:bottom w:val="single" w:color="A6A6A6" w:sz="4"/>
+              <w:right w:val="single" w:color="A6A6A6" w:sz="4"/>
+            </w:tcBorders>
+            <w:tcMar>
+              <w:top w:type="dxa" w:w="50"/>
+              <w:left w:type="dxa" w:w="90"/>
+              <w:bottom w:type="dxa" w:w="50"/>
+              <w:right w:type="dxa" w:w="90"/>
+            </w:tcMar>
+            <w:vAlign w:val="center"/>
+          </w:tcPr>
+          <w:p>
+            <w:pPr>
+              <w:spacing w:after="0" w:line="252"/>
+              <w:jc w:val="left"/>
+            </w:pPr>
+            <w:r>
+              <w:rPr>
+                <w:sz w:val="19"/>
+                <w:szCs w:val="19"/>
+              </w:rPr>
+              <w:t xml:space="preserve">Builds the bronze, silver and gold layers and trains the MLlib model</w:t>
+            </w:r>
+          </w:p>
+        </w:tc>
+      </w:tr>
+      <w:tr>
+        <w:trPr>
+          <w:cantSplit/>
+        </w:trPr>
+        <w:tc>
+          <w:tcPr>
+            <w:tcW w:type="dxa" w:w="1805"/>
+            <w:tcBorders>
+              <w:top w:val="single" w:color="A6A6A6" w:sz="4"/>
+              <w:left w:val="single" w:color="A6A6A6" w:sz="4"/>
+              <w:bottom w:val="single" w:color="A6A6A6" w:sz="4"/>
+              <w:right w:val="single" w:color="A6A6A6" w:sz="4"/>
+            </w:tcBorders>
+            <w:tcMar>
+              <w:top w:type="dxa" w:w="50"/>
+              <w:left w:type="dxa" w:w="90"/>
+              <w:bottom w:type="dxa" w:w="50"/>
+              <w:right w:type="dxa" w:w="90"/>
+            </w:tcMar>
+            <w:vAlign w:val="center"/>
+          </w:tcPr>
+          <w:p>
+            <w:pPr>
+              <w:spacing w:after="0" w:line="252"/>
+              <w:jc w:val="left"/>
+            </w:pPr>
+            <w:r>
+              <w:rPr>
+                <w:sz w:val="19"/>
+                <w:szCs w:val="19"/>
+              </w:rPr>
+              <w:t xml:space="preserve">5. Stream processing</w:t>
+            </w:r>
+          </w:p>
+        </w:tc>
+        <w:tc>
+          <w:tcPr>
+            <w:tcW w:type="dxa" w:w="3069"/>
+            <w:tcBorders>
+              <w:top w:val="single" w:color="A6A6A6" w:sz="4"/>
+              <w:left w:val="single" w:color="A6A6A6" w:sz="4"/>
+              <w:bottom w:val="single" w:color="A6A6A6" w:sz="4"/>
+              <w:right w:val="single" w:color="A6A6A6" w:sz="4"/>
+            </w:tcBorders>
+            <w:tcMar>
+              <w:top w:type="dxa" w:w="50"/>
+              <w:left w:type="dxa" w:w="90"/>
+              <w:bottom w:type="dxa" w:w="50"/>
+              <w:right w:type="dxa" w:w="90"/>
+            </w:tcMar>
+            <w:vAlign w:val="center"/>
+          </w:tcPr>
+          <w:p>
+            <w:pPr>
+              <w:spacing w:after="0" w:line="252"/>
+              <w:jc w:val="left"/>
+            </w:pPr>
+            <w:r>
+              <w:rPr>
+                <w:rFonts w:ascii="Consolas" w:cs="Consolas" w:eastAsia="Consolas" w:hAnsi="Consolas"/>
+                <w:sz w:val="19"/>
+                <w:szCs w:val="19"/>
+              </w:rPr>
+              <w:t xml:space="preserve">./scripts/stream.sh start</w:t>
+            </w:r>
+          </w:p>
+        </w:tc>
+        <w:tc>
+          <w:tcPr>
+            <w:tcW w:type="dxa" w:w="4152"/>
+            <w:tcBorders>
+              <w:top w:val="single" w:color="A6A6A6" w:sz="4"/>
+              <w:left w:val="single" w:color="A6A6A6" w:sz="4"/>
+              <w:bottom w:val="single" w:color="A6A6A6" w:sz="4"/>
+              <w:right w:val="single" w:color="A6A6A6" w:sz="4"/>
+            </w:tcBorders>
+            <w:tcMar>
+              <w:top w:type="dxa" w:w="50"/>
+              <w:left w:type="dxa" w:w="90"/>
+              <w:bottom w:type="dxa" w:w="50"/>
+              <w:right w:type="dxa" w:w="90"/>
+            </w:tcMar>
+            <w:vAlign w:val="center"/>
+          </w:tcPr>
+          <w:p>
+            <w:pPr>
+              <w:spacing w:after="0" w:line="252"/>
+              <w:jc w:val="left"/>
+            </w:pPr>
+            <w:r>
+              <w:rPr>
+                <w:sz w:val="19"/>
+                <w:szCs w:val="19"/>
+              </w:rPr>
+              <w:t xml:space="preserve">Starts the Spark Structured Streaming job</w:t>
+            </w:r>
+          </w:p>
+        </w:tc>
+      </w:tr>
+      <w:tr>
+        <w:trPr>
+          <w:cantSplit/>
+        </w:trPr>
+        <w:tc>
+          <w:tcPr>
+            <w:tcW w:type="dxa" w:w="1805"/>
+            <w:tcBorders>
+              <w:top w:val="single" w:color="A6A6A6" w:sz="4"/>
+              <w:left w:val="single" w:color="A6A6A6" w:sz="4"/>
+              <w:bottom w:val="single" w:color="A6A6A6" w:sz="4"/>
+              <w:right w:val="single" w:color="A6A6A6" w:sz="4"/>
+            </w:tcBorders>
+            <w:tcMar>
+              <w:top w:type="dxa" w:w="50"/>
+              <w:left w:type="dxa" w:w="90"/>
+              <w:bottom w:type="dxa" w:w="50"/>
+              <w:right w:type="dxa" w:w="90"/>
+            </w:tcMar>
+            <w:vAlign w:val="center"/>
+          </w:tcPr>
+          <w:p>
+            <w:pPr>
+              <w:spacing w:after="0" w:line="252"/>
+              <w:jc w:val="left"/>
+            </w:pPr>
+            <w:r>
+              <w:rPr>
+                <w:sz w:val="19"/>
+                <w:szCs w:val="19"/>
+              </w:rPr>
+              <w:t xml:space="preserve">6. Data ingestion</w:t>
+            </w:r>
+          </w:p>
+        </w:tc>
+        <w:tc>
+          <w:tcPr>
+            <w:tcW w:type="dxa" w:w="3069"/>
+            <w:tcBorders>
+              <w:top w:val="single" w:color="A6A6A6" w:sz="4"/>
+              <w:left w:val="single" w:color="A6A6A6" w:sz="4"/>
+              <w:bottom w:val="single" w:color="A6A6A6" w:sz="4"/>
+              <w:right w:val="single" w:color="A6A6A6" w:sz="4"/>
+            </w:tcBorders>
+            <w:tcMar>
+              <w:top w:type="dxa" w:w="50"/>
+              <w:left w:type="dxa" w:w="90"/>
+              <w:bottom w:type="dxa" w:w="50"/>
+              <w:right w:type="dxa" w:w="90"/>
+            </w:tcMar>
+            <w:vAlign w:val="center"/>
+          </w:tcPr>
+          <w:p>
+            <w:pPr>
+              <w:spacing w:after="0" w:line="252"/>
+              <w:jc w:val="left"/>
+            </w:pPr>
+            <w:r>
+              <w:rPr>
+                <w:rFonts w:ascii="Consolas" w:cs="Consolas" w:eastAsia="Consolas" w:hAnsi="Consolas"/>
+                <w:sz w:val="19"/>
+                <w:szCs w:val="19"/>
+              </w:rPr>
+              <w:t xml:space="preserve">./scripts/ingest.sh live_producer</w:t>
+            </w:r>
+          </w:p>
+        </w:tc>
+        <w:tc>
+          <w:tcPr>
+            <w:tcW w:type="dxa" w:w="4152"/>
+            <w:tcBorders>
+              <w:top w:val="single" w:color="A6A6A6" w:sz="4"/>
+              <w:left w:val="single" w:color="A6A6A6" w:sz="4"/>
+              <w:bottom w:val="single" w:color="A6A6A6" w:sz="4"/>
+              <w:right w:val="single" w:color="A6A6A6" w:sz="4"/>
+            </w:tcBorders>
+            <w:tcMar>
+              <w:top w:type="dxa" w:w="50"/>
+              <w:left w:type="dxa" w:w="90"/>
+              <w:bottom w:type="dxa" w:w="50"/>
+              <w:right w:type="dxa" w:w="90"/>
+            </w:tcMar>
+            <w:vAlign w:val="center"/>
+          </w:tcPr>
+          <w:p>
+            <w:pPr>
+              <w:spacing w:after="0" w:line="252"/>
+              <w:jc w:val="left"/>
+            </w:pPr>
+            <w:r>
+              <w:rPr>
+                <w:sz w:val="19"/>
+                <w:szCs w:val="19"/>
+              </w:rPr>
+              <w:t xml:space="preserve">Publishes live ticks to Kafka; </w:t>
+            </w:r>
+            <w:r>
+              <w:rPr>
+                <w:rFonts w:ascii="Consolas" w:cs="Consolas" w:eastAsia="Consolas" w:hAnsi="Consolas"/>
+                <w:sz w:val="19"/>
+                <w:szCs w:val="19"/>
+              </w:rPr>
+              <w:t xml:space="preserve">replay_producer</w:t>
+            </w:r>
+            <w:r>
+              <w:rPr>
+                <w:sz w:val="19"/>
+                <w:szCs w:val="19"/>
+              </w:rPr>
+              <w:t xml:space="preserve"> replays a past trading day instead</w:t>
+            </w:r>
+          </w:p>
+        </w:tc>
+      </w:tr>
+    </w:tbl>
+    <w:p>
+      <w:pPr>
+        <w:spacing w:after="120"/>
+      </w:pPr>
+    </w:p>
+    <w:p>
+      <w:pPr>
+        <w:keepNext/>
+        <w:spacing w:before="220" w:after="80"/>
+        <w:jc w:val="center"/>
+      </w:pPr>
+      <w:r>
+        <w:rPr>
+          <w:b/>
+          <w:bCs/>
+          <w:color w:val="1F4E79"/>
+          <w:sz w:val="20"/>
+          <w:szCs w:val="20"/>
+        </w:rPr>
+        <w:t xml:space="preserve">Table 17: </w:t>
       </w:r>
       <w:r>
         <w:rPr>
@@ -15892,7 +16468,7 @@
           <w:sz w:val="20"/>
           <w:szCs w:val="20"/>
         </w:rPr>
-        <w:t xml:space="preserve">Table 17: </w:t>
+        <w:t xml:space="preserve">Table 18: </w:t>
       </w:r>
       <w:r>
         <w:rPr>
@@ -15901,7 +16477,7 @@
           <w:sz w:val="20"/>
           <w:szCs w:val="20"/>
         </w:rPr>
-        <w:t xml:space="preserve">Division of work (adjust to match the actual split)</w:t>
+        <w:t xml:space="preserve">Division of work</w:t>
       </w:r>
     </w:p>
     <w:tbl>

</xml_diff>